<commit_message>
eLSD CRS: fix figure references, tidy SWC diagram
Co-Authored-By: Claude Opus 5.5 <noreply@anthropic.com>
Claude-Session: https://claude.ai/code/session_01RnMS1B6hoEEYqs9cUbGcsm
</commit_message>
<xml_diff>
--- a/samples/CRS_eLSD_ECU_rev1.0.docx
+++ b/samples/CRS_eLSD_ECU_rev1.0.docx
@@ -22175,7 +22175,7 @@
               <w:rPr>
                 <w:sz w:val="17"/>
               </w:rPr>
-              <w:t>SW는 그림 7의 계층 구조를 따라야 하며 ASW는 MCAL·하드웨어 레지스터에 직접 접근하지 않아야 한다.</w:t>
+              <w:t>SW는 그림 10의 계층 구조를 따라야 하며 ASW는 MCAL·하드웨어 레지스터에 직접 접근하지 않아야 한다.</w:t>
             </w:r>
           </w:p>
         </w:tc>
@@ -22322,7 +22322,7 @@
         <w:rPr>
           <w:i w:val="0"/>
         </w:rPr>
-        <w:t>그림 8은 주요 SWC와 포트 연결이다. 공급사는 SWC 분할을 변경할 수 있으나 ASIL 할당과 감시 구조(제어 경로와 감시 경로 분리)는 유지해야 한다.</w:t>
+        <w:t>그림 11은 주요 SWC와 포트 연결이다. 공급사는 SWC 분할을 변경할 수 있으나 ASIL 할당과 감시 구조(제어 경로와 감시 경로 분리)는 유지해야 한다.</w:t>
       </w:r>
     </w:p>
     <w:p>
@@ -22332,7 +22332,7 @@
       <w:r>
         <w:drawing>
           <wp:inline xmlns:a="http://schemas.openxmlformats.org/drawingml/2006/main" xmlns:pic="http://schemas.openxmlformats.org/drawingml/2006/picture">
-            <wp:extent cx="5472000" cy="2305909"/>
+            <wp:extent cx="5472000" cy="2253529"/>
             <wp:docPr id="11" name="Picture 11"/>
             <wp:cNvGraphicFramePr>
               <a:graphicFrameLocks noChangeAspect="1"/>
@@ -22353,7 +22353,7 @@
                   <pic:spPr>
                     <a:xfrm>
                       <a:off x="0" y="0"/>
-                      <a:ext cx="5472000" cy="2305909"/>
+                      <a:ext cx="5472000" cy="2253529"/>
                     </a:xfrm>
                     <a:prstGeom prst="rect"/>
                   </pic:spPr>

</xml_diff>